<commit_message>
Update pitch deck and memo to reflect v0.2 shipped scope
Roadmap sections in both files still listed devis, UBL 2.1 e-invoicing,
and the accountant multi-client dashboard as in-progress/next -- all
three shipped in Sprint 6/9. Corrected to show v0.2 as shipped, replaced
the stale e-invoicing line with what's actually still blocked (DGI/xHub
sandbox + Barid eSign access, not engineering work), and added a bullet
to each of the memo's three language sections covering the new
capabilities. Also refreshed the deck's dashboard screenshots to current
ones.

Co-Authored-By: Claude Sonnet 5 <noreply@anthropic.com>
</commit_message>
<xml_diff>
--- a/pitch/Moqawil-Pitch-Memo.docx
+++ b/pitch/Moqawil-Pitch-Memo.docx
@@ -239,11 +239,19 @@
         <w:pStyle w:val="ListBullet"/>
       </w:pPr>
       <w:r>
+        <w:t>Interface bilingue français / arabe (RTL complet), auto-hébergeable en une commande Docker.</w:t>
+      </w:r>
+    </w:p>
+    <w:p>
+      <w:pPr>
+        <w:pStyle w:val="ListBullet"/>
+      </w:pPr>
+      <w:r>
         <w:rPr>
           <w:color w:val="1A1A1A"/>
           <w:sz w:val="22"/>
         </w:rPr>
-        <w:t>Interface bilingue français / arabe (RTL complet), auto-hébergeable en une commande Docker.</w:t>
+        <w:t>Devis convertibles en facture en un clic, export e-facturation UBL 2.1 prêt pour la conformité DGI, et espace comptable en lecture seule pour votre expert-comptable, révocable à tout moment.</w:t>
       </w:r>
     </w:p>
     <w:p>
@@ -583,6 +591,14 @@
     <w:p>
       <w:pPr>
         <w:pStyle w:val="ListBullet"/>
+      </w:pPr>
+      <w:r>
+        <w:t>واجهة ثنائية اللغة فرنسية/عربية (RTL كاملة)، تقدر تستضيفها بوحدك بأمر Docker واحد.</w:t>
+      </w:r>
+    </w:p>
+    <w:p>
+      <w:pPr>
+        <w:pStyle w:val="ListBullet"/>
         <w:bidi w:val="1"/>
         <w:jc w:val="right"/>
       </w:pPr>
@@ -593,7 +609,7 @@
           <w:sz w:val="22"/>
           <w:rtl/>
         </w:rPr>
-        <w:t>واجهة ثنائية اللغة فرنسية/عربية (RTL كاملة)، تقدر تستضيفها بوحدك بأمر Docker واحد.</w:t>
+        <w:t>دِيفِي (عرض ثمن) كيتحول لفاكتور بكليك واحد، إكسبور UBL 2.1 جاهز للديجي، وإسباس للمحاسب ديالك يشوف بيه الأرقام بلا ما يبدل والو، تقدر تسحبو ليه الوصول ف أي وقت.</w:t>
       </w:r>
     </w:p>
     <w:p>
@@ -847,11 +863,19 @@
         <w:pStyle w:val="ListBullet"/>
       </w:pPr>
       <w:r>
+        <w:t>Bilingual French/Arabic UI (full RTL support), self-hostable with a single Docker command.</w:t>
+      </w:r>
+    </w:p>
+    <w:p>
+      <w:pPr>
+        <w:pStyle w:val="ListBullet"/>
+      </w:pPr>
+      <w:r>
         <w:rPr>
           <w:color w:val="1A1A1A"/>
           <w:sz w:val="22"/>
         </w:rPr>
-        <w:t>Bilingual French/Arabic UI (full RTL support), self-hostable with a single Docker command.</w:t>
+        <w:t>Quotes that convert to invoices in one click, DGI-ready UBL 2.1 e-invoicing export, and a read-only accountant dashboard for your bookkeeper, revocable anytime.</w:t>
       </w:r>
     </w:p>
     <w:p>
@@ -1741,7 +1765,7 @@
           <w:color w:val="1E8A4C"/>
           <w:sz w:val="22"/>
         </w:rPr>
-        <w:t>Shipped (v0.1): compliant invoicing, live 80K cap tracker, annual threshold alerts, quarterly declaration generator, bilingual FR/AR RTL UI, one-command Docker self-host.</w:t>
+        <w:t>Shipped (v0.2): compliant invoicing, live 80K cap tracker, annual threshold alerts, quarterly declaration generator, devis with one-click invoice conversion, DGI-ready UBL 2.1 e-invoicing export, accountant multi-client read-only dashboard, bilingual FR/AR RTL UI (real content translation, not just layout), one-command Docker self-host.</w:t>
       </w:r>
     </w:p>
     <w:p>
@@ -1753,7 +1777,7 @@
           <w:color w:val="1A1A1A"/>
           <w:sz w:val="22"/>
         </w:rPr>
-        <w:t>In progress: DGI e-invoicing readiness — UBL 2.1 XML export per invoice.</w:t>
+        <w:t>Blocked on external access, not engineering work: full DGI/xHub e-invoicing clearance submission and Barid eSign signing integration both require sandbox/account access from the tax authority.</w:t>
       </w:r>
     </w:p>
     <w:p>
@@ -1765,7 +1789,7 @@
           <w:color w:val="1A1A1A"/>
           <w:sz w:val="22"/>
         </w:rPr>
-        <w:t>Next: accountant multi-client dashboard, quote (devis) management, mobile PWA.</w:t>
+        <w:t>Next: mobile PWA, public launch.</w:t>
       </w:r>
     </w:p>
     <w:p>

</xml_diff>

<commit_message>
Refresh pitch deck and memo for Sprint 11 shipped work + Sprint 12 plan
Business Model and Roadmap sections (deck slides 11+13, memo FR/EN)
now call out Sprint 11's SaaS-readiness hardening as shipped (IDOR
re-audit, rate limiting, health check, automated backups, landing
page) and replace the stale "Next: mobile PWA, public launch" line
with the actual Sprint 12 plan.

Edited via python-pptx/python-docx; layout not visually verified (no
Office/LibreOffice on this machine) — structural validity confirmed
only. Worth a visual check before presenting.

Co-Authored-By: Claude Sonnet 5 <noreply@anthropic.com>
</commit_message>
<xml_diff>
--- a/pitch/Moqawil-Pitch-Memo.docx
+++ b/pitch/Moqawil-Pitch-Memo.docx
@@ -325,7 +325,7 @@
           <w:color w:val="1A1A1A"/>
           <w:sz w:val="22"/>
         </w:rPr>
-        <w:t>Cloud managé (post-lancement) : hébergement clé-en-main, sauvegardes, support — payant, optionnel, jamais requis pour utiliser le produit.</w:t>
+        <w:t>Cloud managé (post-lancement) : hébergement clé-en-main, sauvegardes, support — payant, optionnel, jamais requis pour utiliser le produit. L'infrastructure multi-locataire elle-même est livrée (Sprint 11 : audit IDOR complet, limitation de débit à la connexion, vérification de santé, sauvegardes automatiques) ; l'ouverture publique reste conditionnée à quelques étapes restantes (revue juridique, audit de sécurité), pas à du développement.</w:t>
       </w:r>
     </w:p>
     <w:p>
@@ -1741,7 +1741,7 @@
           <w:color w:val="1A1A1A"/>
           <w:sz w:val="22"/>
         </w:rPr>
-        <w:t>Managed cloud (post-launch): turnkey hosting, backups, support — paid, optional, never required to use the product. Same model that made GitLab, Mattermost, and Supabase durable businesses.</w:t>
+        <w:t>Managed cloud (post-launch): turnkey hosting, backups, support — paid, optional, never required to use the product. The multi-tenant hosting infrastructure itself shipped in Sprint 11 (IDOR re-audit, rate limiting, health checks, automated backups); opening it publicly is gated on a few remaining launch-readiness steps (legal review, a security audit — see Roadmap), not engineering. Same model that made GitLab, Mattermost, and Supabase durable businesses.</w:t>
       </w:r>
     </w:p>
     <w:p>
@@ -1777,6 +1777,18 @@
           <w:color w:val="1A1A1A"/>
           <w:sz w:val="22"/>
         </w:rPr>
+        <w:t>Shipped since v0.2, ahead of a hosted launch: multi-tenant security hardening (a full IDOR re-audit across every query and API route), an in-process sign-in rate limiter, a /api/health liveness endpoint, configurable database connection pooling, automated database backups, and a public FR/AR landing page. Self-hosting is unaffected either way and works today.</w:t>
+      </w:r>
+    </w:p>
+    <w:p>
+      <w:pPr>
+        <w:pStyle w:val="ListBullet"/>
+      </w:pPr>
+      <w:r>
+        <w:rPr>
+          <w:color w:val="1A1A1A"/>
+          <w:sz w:val="22"/>
+        </w:rPr>
         <w:t>Blocked on external access, not engineering work: full DGI/xHub e-invoicing clearance submission and Barid eSign signing integration both require sandbox/account access from the tax authority.</w:t>
       </w:r>
     </w:p>
@@ -1789,7 +1801,7 @@
           <w:color w:val="1A1A1A"/>
           <w:sz w:val="22"/>
         </w:rPr>
-        <w:t>Next: mobile PWA, public launch.</w:t>
+        <w:t>Launch readiness in progress (Sprint 12, planned): Terms of Service and Privacy Policy drafts, CNDP data-controller registration, a third-party security audit, and real VPS/domain provisioning — all owner-side steps ahead of publicly announcing the hosted tier. Self-hosting needs none of this and works today.</w:t>
       </w:r>
     </w:p>
     <w:p>

</xml_diff>